<commit_message>
Update Software build Instructions.docx
</commit_message>
<xml_diff>
--- a/Software build Instructions.docx
+++ b/Software build Instructions.docx
@@ -1067,7 +1067,7 @@
           </mc:Choice>
           <mc:Fallback>
             <w:pict>
-              <v:shapetype w14:anchorId="523D4A6E" id="_x0000_t75" coordsize="21600,21600" o:spt="75" o:preferrelative="t" path="m@4@5l@4@11@9@11@9@5xe" filled="f" stroked="f">
+              <v:shapetype w14:anchorId="0F17CA6B" id="_x0000_t75" coordsize="21600,21600" o:spt="75" o:preferrelative="t" path="m@4@5l@4@11@9@11@9@5xe" filled="f" stroked="f">
                 <v:stroke joinstyle="miter"/>
                 <v:formulas>
                   <v:f eqn="if lineDrawn pixelLineWidth 0"/>
@@ -1290,7 +1290,7 @@
           </mc:Choice>
           <mc:Fallback>
             <w:pict>
-              <v:shape w14:anchorId="2B0ACDAA" id="Ink 4" o:spid="_x0000_s1026" type="#_x0000_t75" style="position:absolute;margin-left:143.5pt;margin-top:-2pt;width:103.75pt;height:18.95pt;z-index:251666432;visibility:visible;mso-wrap-style:square;mso-wrap-distance-left:9pt;mso-wrap-distance-top:0;mso-wrap-distance-right:9pt;mso-wrap-distance-bottom:0;mso-position-horizontal:absolute;mso-position-horizontal-relative:text;mso-position-vertical:absolute;mso-position-vertical-relative:text" o:gfxdata="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">
+              <v:shape w14:anchorId="06935DAA" id="Ink 4" o:spid="_x0000_s1026" type="#_x0000_t75" style="position:absolute;margin-left:143.5pt;margin-top:-2pt;width:103.75pt;height:18.95pt;z-index:251666432;visibility:visible;mso-wrap-style:square;mso-wrap-distance-left:9pt;mso-wrap-distance-top:0;mso-wrap-distance-right:9pt;mso-wrap-distance-bottom:0;mso-position-horizontal:absolute;mso-position-horizontal-relative:text;mso-position-vertical:absolute;mso-position-vertical-relative:text" o:gfxdata="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">
                 <v:imagedata r:id="rId18" o:title=""/>
               </v:shape>
             </w:pict>
@@ -2118,7 +2118,7 @@
           </mc:Choice>
           <mc:Fallback>
             <w:pict>
-              <v:shape w14:anchorId="4CEB5870" id="Ink 5" o:spid="_x0000_s1026" type="#_x0000_t75" style="position:absolute;margin-left:328.65pt;margin-top:43.95pt;width:87.35pt;height:18.8pt;z-index:251667456;visibility:visible;mso-wrap-style:square;mso-wrap-distance-left:9pt;mso-wrap-distance-top:0;mso-wrap-distance-right:9pt;mso-wrap-distance-bottom:0;mso-position-horizontal:absolute;mso-position-horizontal-relative:text;mso-position-vertical:absolute;mso-position-vertical-relative:text" o:gfxdata="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">
+              <v:shape w14:anchorId="4A559DE9" id="Ink 5" o:spid="_x0000_s1026" type="#_x0000_t75" style="position:absolute;margin-left:328.65pt;margin-top:43.95pt;width:87.35pt;height:18.8pt;z-index:251667456;visibility:visible;mso-wrap-style:square;mso-wrap-distance-left:9pt;mso-wrap-distance-top:0;mso-wrap-distance-right:9pt;mso-wrap-distance-bottom:0;mso-position-horizontal:absolute;mso-position-horizontal-relative:text;mso-position-vertical:absolute;mso-position-vertical-relative:text" o:gfxdata="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">
                 <v:imagedata r:id="rId27" o:title=""/>
               </v:shape>
             </w:pict>
@@ -2542,15 +2542,38 @@
     <w:p/>
     <w:p>
       <w:r>
-        <w:t xml:space="preserve">This is the most exciting step. It all comes together.   If anything does not work in this step, go back and re-do/recheck all of the above software installs. Everything you just did is “re-doable” as many times as necessary to get it right. </w:t>
-      </w:r>
-    </w:p>
-    <w:p>
-      <w:r>
-        <w:t xml:space="preserve">Place and open the source file. Best practice is to place the entire folder called </w:t>
+        <w:t>This is the most exciting step. It all comes together</w:t>
+      </w:r>
+      <w:r>
+        <w:t xml:space="preserve"> now</w:t>
+      </w:r>
+      <w:r>
+        <w:t xml:space="preserve">.   If anything does not work in this step, go back and re-do/recheck all of the above software installs. Everything you just did is “re-doable” as many times as necessary to get it right. </w:t>
+      </w:r>
+    </w:p>
+    <w:p>
+      <w:r>
+        <w:t xml:space="preserve">Best practice is to place the entire folder called </w:t>
       </w:r>
       <w:r>
         <w:t>Badge_V1_3e into Documents/Arduino (default location of all Arduino source code. aka “sketches”.)</w:t>
+      </w:r>
+    </w:p>
+    <w:p>
+      <w:r>
+        <w:t xml:space="preserve">This is made easiest by just pulling the zip file with everything in it. </w:t>
+      </w:r>
+      <w:r>
+        <w:t>Unzip the file called Badge_V1_3e.zip into Documents\Arduino</w:t>
+      </w:r>
+      <w:r>
+        <w:t>\</w:t>
+      </w:r>
+      <w:r>
+        <w:t>.  Be sure to place the entire folder with all files underneath.</w:t>
+      </w:r>
+      <w:r>
+        <w:t xml:space="preserve"> </w:t>
       </w:r>
     </w:p>
     <w:p>
@@ -2746,18 +2769,14 @@
         <w:t xml:space="preserve"> file</w:t>
       </w:r>
       <w:r>
-        <w:t>.  The folder itself can reside anywhere, but is I recommended to use the default of Documents\Arduino.</w:t>
-      </w:r>
-    </w:p>
-    <w:p>
-      <w:pPr>
-        <w:keepNext/>
-      </w:pPr>
-    </w:p>
-    <w:p>
-      <w:pPr>
-        <w:keepNext/>
-      </w:pPr>
+        <w:t xml:space="preserve">.  The folder itself can reside anywhere, but </w:t>
+      </w:r>
+      <w:r>
+        <w:t>it is</w:t>
+      </w:r>
+      <w:r>
+        <w:t xml:space="preserve"> recommended to use the default of Documents\Arduino.</w:t>
+      </w:r>
     </w:p>
     <w:p>
       <w:pPr>
@@ -2842,6 +2861,11 @@
       <w:pPr>
         <w:pStyle w:val="Heading4"/>
       </w:pPr>
+    </w:p>
+    <w:p>
+      <w:pPr>
+        <w:pStyle w:val="Heading4"/>
+      </w:pPr>
       <w:r>
         <w:t>Compile command and result</w:t>
       </w:r>
@@ -2927,7 +2951,7 @@
           </mc:Choice>
           <mc:Fallback>
             <w:pict>
-              <v:shape w14:anchorId="795E74FB" id="Ink 4" o:spid="_x0000_s1026" type="#_x0000_t75" style="position:absolute;margin-left:53.1pt;margin-top:55.4pt;width:86.2pt;height:19.2pt;z-index:251671552;visibility:visible;mso-wrap-style:square;mso-wrap-distance-left:9pt;mso-wrap-distance-top:0;mso-wrap-distance-right:9pt;mso-wrap-distance-bottom:0;mso-position-horizontal:absolute;mso-position-horizontal-relative:text;mso-position-vertical:absolute;mso-position-vertical-relative:text" o:gfxdata="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">
+              <v:shape w14:anchorId="65AFB829" id="Ink 4" o:spid="_x0000_s1026" type="#_x0000_t75" style="position:absolute;margin-left:53.1pt;margin-top:55.4pt;width:86.2pt;height:19.2pt;z-index:251671552;visibility:visible;mso-wrap-style:square;mso-wrap-distance-left:9pt;mso-wrap-distance-top:0;mso-wrap-distance-right:9pt;mso-wrap-distance-bottom:0;mso-position-horizontal:absolute;mso-position-horizontal-relative:text;mso-position-vertical:absolute;mso-position-vertical-relative:text" o:gfxdata="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">
                 <v:imagedata r:id="rId36" o:title=""/>
               </v:shape>
             </w:pict>
@@ -3053,7 +3077,7 @@
           </mc:Choice>
           <mc:Fallback>
             <w:pict>
-              <v:shape w14:anchorId="51AEA546" id="Ink 5" o:spid="_x0000_s1026" type="#_x0000_t75" style="position:absolute;margin-left:72.3pt;margin-top:26.95pt;width:103pt;height:21.55pt;z-index:251672576;visibility:visible;mso-wrap-style:square;mso-wrap-distance-left:9pt;mso-wrap-distance-top:0;mso-wrap-distance-right:9pt;mso-wrap-distance-bottom:0;mso-position-horizontal:absolute;mso-position-horizontal-relative:text;mso-position-vertical:absolute;mso-position-vertical-relative:text" o:gfxdata="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">
+              <v:shape w14:anchorId="413EC560" id="Ink 5" o:spid="_x0000_s1026" type="#_x0000_t75" style="position:absolute;margin-left:72.3pt;margin-top:26.95pt;width:103pt;height:21.55pt;z-index:251672576;visibility:visible;mso-wrap-style:square;mso-wrap-distance-left:9pt;mso-wrap-distance-top:0;mso-wrap-distance-right:9pt;mso-wrap-distance-bottom:0;mso-position-horizontal:absolute;mso-position-horizontal-relative:text;mso-position-vertical:absolute;mso-position-vertical-relative:text" o:gfxdata="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">
                 <v:imagedata r:id="rId39" o:title=""/>
               </v:shape>
             </w:pict>
@@ -3098,7 +3122,7 @@
           </mc:Choice>
           <mc:Fallback>
             <w:pict>
-              <v:shape w14:anchorId="095890C8" id="Ink 3" o:spid="_x0000_s1026" type="#_x0000_t75" style="position:absolute;margin-left:220.75pt;margin-top:164.7pt;width:58pt;height:17.8pt;z-index:251670528;visibility:visible;mso-wrap-style:square;mso-wrap-distance-left:9pt;mso-wrap-distance-top:0;mso-wrap-distance-right:9pt;mso-wrap-distance-bottom:0;mso-position-horizontal:absolute;mso-position-horizontal-relative:text;mso-position-vertical:absolute;mso-position-vertical-relative:text" o:gfxdata="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">
+              <v:shape w14:anchorId="0B3E9162" id="Ink 3" o:spid="_x0000_s1026" type="#_x0000_t75" style="position:absolute;margin-left:220.75pt;margin-top:164.7pt;width:58pt;height:17.8pt;z-index:251670528;visibility:visible;mso-wrap-style:square;mso-wrap-distance-left:9pt;mso-wrap-distance-top:0;mso-wrap-distance-right:9pt;mso-wrap-distance-bottom:0;mso-position-horizontal:absolute;mso-position-horizontal-relative:text;mso-position-vertical:absolute;mso-position-vertical-relative:text" o:gfxdata="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">
                 <v:imagedata r:id="rId41" o:title=""/>
               </v:shape>
             </w:pict>
@@ -3143,7 +3167,7 @@
           </mc:Choice>
           <mc:Fallback>
             <w:pict>
-              <v:shape w14:anchorId="2AC8569C" id="Ink 2" o:spid="_x0000_s1026" type="#_x0000_t75" style="position:absolute;margin-left:155.55pt;margin-top:90.45pt;width:33.95pt;height:17.05pt;z-index:251669504;visibility:visible;mso-wrap-style:square;mso-wrap-distance-left:9pt;mso-wrap-distance-top:0;mso-wrap-distance-right:9pt;mso-wrap-distance-bottom:0;mso-position-horizontal:absolute;mso-position-horizontal-relative:text;mso-position-vertical:absolute;mso-position-vertical-relative:text" o:gfxdata="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">
+              <v:shape w14:anchorId="1E0FD91A" id="Ink 2" o:spid="_x0000_s1026" type="#_x0000_t75" style="position:absolute;margin-left:155.55pt;margin-top:90.45pt;width:33.95pt;height:17.05pt;z-index:251669504;visibility:visible;mso-wrap-style:square;mso-wrap-distance-left:9pt;mso-wrap-distance-top:0;mso-wrap-distance-right:9pt;mso-wrap-distance-bottom:0;mso-position-horizontal:absolute;mso-position-horizontal-relative:text;mso-position-vertical:absolute;mso-position-vertical-relative:text" o:gfxdata="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">
                 <v:imagedata r:id="rId43" o:title=""/>
               </v:shape>
             </w:pict>
@@ -3700,7 +3724,7 @@
           </mc:Choice>
           <mc:Fallback>
             <w:pict>
-              <v:shape w14:anchorId="30260649" id="Ink 6" o:spid="_x0000_s1026" type="#_x0000_t75" style="position:absolute;margin-left:59.15pt;margin-top:53.45pt;width:251.1pt;height:19.45pt;z-index:251673600;visibility:visible;mso-wrap-style:square;mso-wrap-distance-left:9pt;mso-wrap-distance-top:0;mso-wrap-distance-right:9pt;mso-wrap-distance-bottom:0;mso-position-horizontal:absolute;mso-position-horizontal-relative:text;mso-position-vertical:absolute;mso-position-vertical-relative:text" o:gfxdata="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">
+              <v:shape w14:anchorId="558463EC" id="Ink 6" o:spid="_x0000_s1026" type="#_x0000_t75" style="position:absolute;margin-left:59.15pt;margin-top:53.45pt;width:251.1pt;height:19.45pt;z-index:251673600;visibility:visible;mso-wrap-style:square;mso-wrap-distance-left:9pt;mso-wrap-distance-top:0;mso-wrap-distance-right:9pt;mso-wrap-distance-bottom:0;mso-position-horizontal:absolute;mso-position-horizontal-relative:text;mso-position-vertical:absolute;mso-position-vertical-relative:text" o:gfxdata="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">
                 <v:imagedata r:id="rId51" o:title=""/>
               </v:shape>
             </w:pict>
@@ -4168,7 +4192,7 @@
           </mc:Choice>
           <mc:Fallback>
             <w:pict>
-              <v:shape w14:anchorId="21EDB74B" id="Ink 7" o:spid="_x0000_s1026" type="#_x0000_t75" style="position:absolute;margin-left:6.7pt;margin-top:22.85pt;width:44.05pt;height:23.9pt;z-index:251674624;visibility:visible;mso-wrap-style:square;mso-wrap-distance-left:9pt;mso-wrap-distance-top:0;mso-wrap-distance-right:9pt;mso-wrap-distance-bottom:0;mso-position-horizontal:absolute;mso-position-horizontal-relative:text;mso-position-vertical:absolute;mso-position-vertical-relative:text" o:gfxdata="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">
+              <v:shape w14:anchorId="2309306F" id="Ink 7" o:spid="_x0000_s1026" type="#_x0000_t75" style="position:absolute;margin-left:6.7pt;margin-top:22.85pt;width:44.05pt;height:23.9pt;z-index:251674624;visibility:visible;mso-wrap-style:square;mso-wrap-distance-left:9pt;mso-wrap-distance-top:0;mso-wrap-distance-right:9pt;mso-wrap-distance-bottom:0;mso-position-horizontal:absolute;mso-position-horizontal-relative:text;mso-position-vertical:absolute;mso-position-vertical-relative:text" o:gfxdata="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">
                 <v:imagedata r:id="rId57" o:title=""/>
               </v:shape>
             </w:pict>
@@ -4262,7 +4286,7 @@
           </mc:Choice>
           <mc:Fallback>
             <w:pict>
-              <v:shape w14:anchorId="59FA8677" id="Ink 8" o:spid="_x0000_s1026" type="#_x0000_t75" style="position:absolute;margin-left:7.8pt;margin-top:27.4pt;width:78.1pt;height:20.85pt;z-index:251675648;visibility:visible;mso-wrap-style:square;mso-wrap-distance-left:9pt;mso-wrap-distance-top:0;mso-wrap-distance-right:9pt;mso-wrap-distance-bottom:0;mso-position-horizontal:absolute;mso-position-horizontal-relative:text;mso-position-vertical:absolute;mso-position-vertical-relative:text" o:gfxdata="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">
+              <v:shape w14:anchorId="26AC6789" id="Ink 8" o:spid="_x0000_s1026" type="#_x0000_t75" style="position:absolute;margin-left:7.8pt;margin-top:27.4pt;width:78.1pt;height:20.85pt;z-index:251675648;visibility:visible;mso-wrap-style:square;mso-wrap-distance-left:9pt;mso-wrap-distance-top:0;mso-wrap-distance-right:9pt;mso-wrap-distance-bottom:0;mso-position-horizontal:absolute;mso-position-horizontal-relative:text;mso-position-vertical:absolute;mso-position-vertical-relative:text" o:gfxdata="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">
                 <v:imagedata r:id="rId60" o:title=""/>
               </v:shape>
             </w:pict>

</xml_diff>

<commit_message>
Added new software to bld
</commit_message>
<xml_diff>
--- a/Software build Instructions.docx
+++ b/Software build Instructions.docx
@@ -1067,7 +1067,7 @@
           </mc:Choice>
           <mc:Fallback>
             <w:pict>
-              <v:shapetype w14:anchorId="0F17CA6B" id="_x0000_t75" coordsize="21600,21600" o:spt="75" o:preferrelative="t" path="m@4@5l@4@11@9@11@9@5xe" filled="f" stroked="f">
+              <v:shapetype w14:anchorId="010B07D3" id="_x0000_t75" coordsize="21600,21600" o:spt="75" o:preferrelative="t" path="m@4@5l@4@11@9@11@9@5xe" filled="f" stroked="f">
                 <v:stroke joinstyle="miter"/>
                 <v:formulas>
                   <v:f eqn="if lineDrawn pixelLineWidth 0"/>
@@ -1290,7 +1290,7 @@
           </mc:Choice>
           <mc:Fallback>
             <w:pict>
-              <v:shape w14:anchorId="06935DAA" id="Ink 4" o:spid="_x0000_s1026" type="#_x0000_t75" style="position:absolute;margin-left:143.5pt;margin-top:-2pt;width:103.75pt;height:18.95pt;z-index:251666432;visibility:visible;mso-wrap-style:square;mso-wrap-distance-left:9pt;mso-wrap-distance-top:0;mso-wrap-distance-right:9pt;mso-wrap-distance-bottom:0;mso-position-horizontal:absolute;mso-position-horizontal-relative:text;mso-position-vertical:absolute;mso-position-vertical-relative:text" o:gfxdata="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">
+              <v:shape w14:anchorId="2142D1CD" id="Ink 4" o:spid="_x0000_s1026" type="#_x0000_t75" style="position:absolute;margin-left:143.5pt;margin-top:-2pt;width:103.75pt;height:18.95pt;z-index:251666432;visibility:visible;mso-wrap-style:square;mso-wrap-distance-left:9pt;mso-wrap-distance-top:0;mso-wrap-distance-right:9pt;mso-wrap-distance-bottom:0;mso-position-horizontal:absolute;mso-position-horizontal-relative:text;mso-position-vertical:absolute;mso-position-vertical-relative:text" o:gfxdata="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">
                 <v:imagedata r:id="rId18" o:title=""/>
               </v:shape>
             </w:pict>
@@ -2118,7 +2118,7 @@
           </mc:Choice>
           <mc:Fallback>
             <w:pict>
-              <v:shape w14:anchorId="4A559DE9" id="Ink 5" o:spid="_x0000_s1026" type="#_x0000_t75" style="position:absolute;margin-left:328.65pt;margin-top:43.95pt;width:87.35pt;height:18.8pt;z-index:251667456;visibility:visible;mso-wrap-style:square;mso-wrap-distance-left:9pt;mso-wrap-distance-top:0;mso-wrap-distance-right:9pt;mso-wrap-distance-bottom:0;mso-position-horizontal:absolute;mso-position-horizontal-relative:text;mso-position-vertical:absolute;mso-position-vertical-relative:text" o:gfxdata="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">
+              <v:shape w14:anchorId="6A0174E6" id="Ink 5" o:spid="_x0000_s1026" type="#_x0000_t75" style="position:absolute;margin-left:328.65pt;margin-top:43.95pt;width:87.35pt;height:18.8pt;z-index:251667456;visibility:visible;mso-wrap-style:square;mso-wrap-distance-left:9pt;mso-wrap-distance-top:0;mso-wrap-distance-right:9pt;mso-wrap-distance-bottom:0;mso-position-horizontal:absolute;mso-position-horizontal-relative:text;mso-position-vertical:absolute;mso-position-vertical-relative:text" o:gfxdata="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">
                 <v:imagedata r:id="rId27" o:title=""/>
               </v:shape>
             </w:pict>
@@ -2951,7 +2951,7 @@
           </mc:Choice>
           <mc:Fallback>
             <w:pict>
-              <v:shape w14:anchorId="65AFB829" id="Ink 4" o:spid="_x0000_s1026" type="#_x0000_t75" style="position:absolute;margin-left:53.1pt;margin-top:55.4pt;width:86.2pt;height:19.2pt;z-index:251671552;visibility:visible;mso-wrap-style:square;mso-wrap-distance-left:9pt;mso-wrap-distance-top:0;mso-wrap-distance-right:9pt;mso-wrap-distance-bottom:0;mso-position-horizontal:absolute;mso-position-horizontal-relative:text;mso-position-vertical:absolute;mso-position-vertical-relative:text" o:gfxdata="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">
+              <v:shape w14:anchorId="7C8D06E1" id="Ink 4" o:spid="_x0000_s1026" type="#_x0000_t75" style="position:absolute;margin-left:53.1pt;margin-top:55.4pt;width:86.2pt;height:19.2pt;z-index:251671552;visibility:visible;mso-wrap-style:square;mso-wrap-distance-left:9pt;mso-wrap-distance-top:0;mso-wrap-distance-right:9pt;mso-wrap-distance-bottom:0;mso-position-horizontal:absolute;mso-position-horizontal-relative:text;mso-position-vertical:absolute;mso-position-vertical-relative:text" o:gfxdata="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">
                 <v:imagedata r:id="rId36" o:title=""/>
               </v:shape>
             </w:pict>
@@ -3077,7 +3077,7 @@
           </mc:Choice>
           <mc:Fallback>
             <w:pict>
-              <v:shape w14:anchorId="413EC560" id="Ink 5" o:spid="_x0000_s1026" type="#_x0000_t75" style="position:absolute;margin-left:72.3pt;margin-top:26.95pt;width:103pt;height:21.55pt;z-index:251672576;visibility:visible;mso-wrap-style:square;mso-wrap-distance-left:9pt;mso-wrap-distance-top:0;mso-wrap-distance-right:9pt;mso-wrap-distance-bottom:0;mso-position-horizontal:absolute;mso-position-horizontal-relative:text;mso-position-vertical:absolute;mso-position-vertical-relative:text" o:gfxdata="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">
+              <v:shape w14:anchorId="0C499D5F" id="Ink 5" o:spid="_x0000_s1026" type="#_x0000_t75" style="position:absolute;margin-left:72.3pt;margin-top:26.95pt;width:103pt;height:21.55pt;z-index:251672576;visibility:visible;mso-wrap-style:square;mso-wrap-distance-left:9pt;mso-wrap-distance-top:0;mso-wrap-distance-right:9pt;mso-wrap-distance-bottom:0;mso-position-horizontal:absolute;mso-position-horizontal-relative:text;mso-position-vertical:absolute;mso-position-vertical-relative:text" o:gfxdata="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">
                 <v:imagedata r:id="rId39" o:title=""/>
               </v:shape>
             </w:pict>
@@ -3122,7 +3122,7 @@
           </mc:Choice>
           <mc:Fallback>
             <w:pict>
-              <v:shape w14:anchorId="0B3E9162" id="Ink 3" o:spid="_x0000_s1026" type="#_x0000_t75" style="position:absolute;margin-left:220.75pt;margin-top:164.7pt;width:58pt;height:17.8pt;z-index:251670528;visibility:visible;mso-wrap-style:square;mso-wrap-distance-left:9pt;mso-wrap-distance-top:0;mso-wrap-distance-right:9pt;mso-wrap-distance-bottom:0;mso-position-horizontal:absolute;mso-position-horizontal-relative:text;mso-position-vertical:absolute;mso-position-vertical-relative:text" o:gfxdata="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">
+              <v:shape w14:anchorId="6FFA035D" id="Ink 3" o:spid="_x0000_s1026" type="#_x0000_t75" style="position:absolute;margin-left:220.75pt;margin-top:164.7pt;width:58pt;height:17.8pt;z-index:251670528;visibility:visible;mso-wrap-style:square;mso-wrap-distance-left:9pt;mso-wrap-distance-top:0;mso-wrap-distance-right:9pt;mso-wrap-distance-bottom:0;mso-position-horizontal:absolute;mso-position-horizontal-relative:text;mso-position-vertical:absolute;mso-position-vertical-relative:text" o:gfxdata="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">
                 <v:imagedata r:id="rId41" o:title=""/>
               </v:shape>
             </w:pict>
@@ -3167,7 +3167,7 @@
           </mc:Choice>
           <mc:Fallback>
             <w:pict>
-              <v:shape w14:anchorId="1E0FD91A" id="Ink 2" o:spid="_x0000_s1026" type="#_x0000_t75" style="position:absolute;margin-left:155.55pt;margin-top:90.45pt;width:33.95pt;height:17.05pt;z-index:251669504;visibility:visible;mso-wrap-style:square;mso-wrap-distance-left:9pt;mso-wrap-distance-top:0;mso-wrap-distance-right:9pt;mso-wrap-distance-bottom:0;mso-position-horizontal:absolute;mso-position-horizontal-relative:text;mso-position-vertical:absolute;mso-position-vertical-relative:text" o:gfxdata="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">
+              <v:shape w14:anchorId="5D4BB9F9" id="Ink 2" o:spid="_x0000_s1026" type="#_x0000_t75" style="position:absolute;margin-left:155.55pt;margin-top:90.45pt;width:33.95pt;height:17.05pt;z-index:251669504;visibility:visible;mso-wrap-style:square;mso-wrap-distance-left:9pt;mso-wrap-distance-top:0;mso-wrap-distance-right:9pt;mso-wrap-distance-bottom:0;mso-position-horizontal:absolute;mso-position-horizontal-relative:text;mso-position-vertical:absolute;mso-position-vertical-relative:text" o:gfxdata="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">
                 <v:imagedata r:id="rId43" o:title=""/>
               </v:shape>
             </w:pict>
@@ -3724,7 +3724,7 @@
           </mc:Choice>
           <mc:Fallback>
             <w:pict>
-              <v:shape w14:anchorId="558463EC" id="Ink 6" o:spid="_x0000_s1026" type="#_x0000_t75" style="position:absolute;margin-left:59.15pt;margin-top:53.45pt;width:251.1pt;height:19.45pt;z-index:251673600;visibility:visible;mso-wrap-style:square;mso-wrap-distance-left:9pt;mso-wrap-distance-top:0;mso-wrap-distance-right:9pt;mso-wrap-distance-bottom:0;mso-position-horizontal:absolute;mso-position-horizontal-relative:text;mso-position-vertical:absolute;mso-position-vertical-relative:text" o:gfxdata="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">
+              <v:shape w14:anchorId="129209F6" id="Ink 6" o:spid="_x0000_s1026" type="#_x0000_t75" style="position:absolute;margin-left:59.15pt;margin-top:53.45pt;width:251.1pt;height:19.45pt;z-index:251673600;visibility:visible;mso-wrap-style:square;mso-wrap-distance-left:9pt;mso-wrap-distance-top:0;mso-wrap-distance-right:9pt;mso-wrap-distance-bottom:0;mso-position-horizontal:absolute;mso-position-horizontal-relative:text;mso-position-vertical:absolute;mso-position-vertical-relative:text" o:gfxdata="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">
                 <v:imagedata r:id="rId51" o:title=""/>
               </v:shape>
             </w:pict>
@@ -4192,7 +4192,7 @@
           </mc:Choice>
           <mc:Fallback>
             <w:pict>
-              <v:shape w14:anchorId="2309306F" id="Ink 7" o:spid="_x0000_s1026" type="#_x0000_t75" style="position:absolute;margin-left:6.7pt;margin-top:22.85pt;width:44.05pt;height:23.9pt;z-index:251674624;visibility:visible;mso-wrap-style:square;mso-wrap-distance-left:9pt;mso-wrap-distance-top:0;mso-wrap-distance-right:9pt;mso-wrap-distance-bottom:0;mso-position-horizontal:absolute;mso-position-horizontal-relative:text;mso-position-vertical:absolute;mso-position-vertical-relative:text" o:gfxdata="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">
+              <v:shape w14:anchorId="4C38D08D" id="Ink 7" o:spid="_x0000_s1026" type="#_x0000_t75" style="position:absolute;margin-left:6.7pt;margin-top:22.85pt;width:44.05pt;height:23.9pt;z-index:251674624;visibility:visible;mso-wrap-style:square;mso-wrap-distance-left:9pt;mso-wrap-distance-top:0;mso-wrap-distance-right:9pt;mso-wrap-distance-bottom:0;mso-position-horizontal:absolute;mso-position-horizontal-relative:text;mso-position-vertical:absolute;mso-position-vertical-relative:text" o:gfxdata="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">
                 <v:imagedata r:id="rId57" o:title=""/>
               </v:shape>
             </w:pict>
@@ -4286,7 +4286,7 @@
           </mc:Choice>
           <mc:Fallback>
             <w:pict>
-              <v:shape w14:anchorId="26AC6789" id="Ink 8" o:spid="_x0000_s1026" type="#_x0000_t75" style="position:absolute;margin-left:7.8pt;margin-top:27.4pt;width:78.1pt;height:20.85pt;z-index:251675648;visibility:visible;mso-wrap-style:square;mso-wrap-distance-left:9pt;mso-wrap-distance-top:0;mso-wrap-distance-right:9pt;mso-wrap-distance-bottom:0;mso-position-horizontal:absolute;mso-position-horizontal-relative:text;mso-position-vertical:absolute;mso-position-vertical-relative:text" o:gfxdata="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">
+              <v:shape w14:anchorId="15F7C98C" id="Ink 8" o:spid="_x0000_s1026" type="#_x0000_t75" style="position:absolute;margin-left:7.8pt;margin-top:27.4pt;width:78.1pt;height:20.85pt;z-index:251675648;visibility:visible;mso-wrap-style:square;mso-wrap-distance-left:9pt;mso-wrap-distance-top:0;mso-wrap-distance-right:9pt;mso-wrap-distance-bottom:0;mso-position-horizontal:absolute;mso-position-horizontal-relative:text;mso-position-vertical:absolute;mso-position-vertical-relative:text" o:gfxdata="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">
                 <v:imagedata r:id="rId60" o:title=""/>
               </v:shape>
             </w:pict>

</xml_diff>